<commit_message>
Add attestation generation feature with API endpoints, update .env.example for attestation paths, and enhance admin sidebar for attestation access
</commit_message>
<xml_diff>
--- a/templates/Modele2024Attestationdestage.docx
+++ b/templates/Modele2024Attestationdestage.docx
@@ -16,7 +16,7 @@
           <w:sz w:val="20"/>
         </w:rPr>
         <w:drawing>
-          <wp:anchor distT="0" distB="0" distL="114300" distR="114300" simplePos="0" relativeHeight="251660288" behindDoc="1" locked="0" layoutInCell="1" allowOverlap="1" wp14:anchorId="6B2E9F53" wp14:editId="0B729431">
+          <wp:anchor distT="0" distB="0" distL="114300" distR="114300" simplePos="0" relativeHeight="251660288" behindDoc="1" locked="0" layoutInCell="1" allowOverlap="1" wp14:anchorId="6B2E9F53" wp14:editId="5F65B25E">
             <wp:simplePos x="0" y="0"/>
             <wp:positionH relativeFrom="page">
               <wp:align>center</wp:align>
@@ -684,7 +684,6 @@
               <w:pStyle w:val="TableParagraph"/>
               <w:rPr>
                 <w:rFonts w:ascii="DIN" w:hAnsi="DIN" w:cstheme="minorHAnsi"/>
-                <w:b/>
                 <w:bCs/>
                 <w:sz w:val="18"/>
                 <w:szCs w:val="18"/>
@@ -693,7 +692,7 @@
             <w:r>
               <w:rPr>
                 <w:rFonts w:ascii="DIN" w:hAnsi="DIN" w:cstheme="minorHAnsi"/>
-                <w:b/>
+                <w:bCs/>
                 <w:iCs/>
                 <w:color w:val="000000" w:themeColor="text1"/>
                 <w:sz w:val="18"/>
@@ -703,8 +702,18 @@
             </w:r>
             <w:r>
               <w:rPr>
+                <w:rFonts w:ascii="DIN" w:hAnsi="DIN" w:cstheme="minorHAnsi"/>
+                <w:bCs/>
+                <w:iCs/>
+                <w:color w:val="000000" w:themeColor="text1"/>
+                <w:sz w:val="18"/>
+                <w:szCs w:val="18"/>
+              </w:rPr>
+              <w:t>{</w:t>
+            </w:r>
+            <w:r>
+              <w:rPr>
                 <w:rFonts w:ascii="DIN" w:hAnsi="DIN" w:cstheme="majorHAnsi"/>
-                <w:b/>
                 <w:bCs/>
                 <w:noProof/>
                 <w:color w:val="000000" w:themeColor="text1"/>
@@ -716,7 +725,6 @@
             <w:r>
               <w:rPr>
                 <w:rFonts w:ascii="DIN" w:hAnsi="DIN" w:cstheme="majorHAnsi"/>
-                <w:b/>
                 <w:bCs/>
                 <w:noProof/>
                 <w:color w:val="000000" w:themeColor="text1"/>
@@ -728,7 +736,6 @@
             <w:r>
               <w:rPr>
                 <w:rFonts w:ascii="DIN" w:hAnsi="DIN" w:cstheme="majorHAnsi"/>
-                <w:b/>
                 <w:bCs/>
                 <w:noProof/>
                 <w:color w:val="000000" w:themeColor="text1"/>
@@ -740,7 +747,6 @@
             <w:r>
               <w:rPr>
                 <w:rFonts w:ascii="DIN" w:hAnsi="DIN" w:cstheme="majorHAnsi"/>
-                <w:b/>
                 <w:bCs/>
                 <w:noProof/>
                 <w:color w:val="000000" w:themeColor="text1"/>
@@ -752,7 +758,6 @@
             <w:r>
               <w:rPr>
                 <w:rFonts w:ascii="DIN" w:hAnsi="DIN" w:cstheme="majorHAnsi"/>
-                <w:b/>
                 <w:bCs/>
                 <w:noProof/>
                 <w:color w:val="000000" w:themeColor="text1"/>
@@ -760,6 +765,17 @@
                 <w:szCs w:val="18"/>
               </w:rPr>
               <w:fldChar w:fldCharType="end"/>
+            </w:r>
+            <w:r>
+              <w:rPr>
+                <w:rFonts w:ascii="DIN" w:hAnsi="DIN" w:cstheme="majorHAnsi"/>
+                <w:bCs/>
+                <w:noProof/>
+                <w:color w:val="000000" w:themeColor="text1"/>
+                <w:sz w:val="18"/>
+                <w:szCs w:val="18"/>
+              </w:rPr>
+              <w:t>}</w:t>
             </w:r>
           </w:p>
         </w:tc>
@@ -818,6 +834,7 @@
               <w:pStyle w:val="TableParagraph"/>
               <w:rPr>
                 <w:rFonts w:ascii="DIN" w:hAnsi="DIN" w:cstheme="minorHAnsi"/>
+                <w:bCs/>
                 <w:sz w:val="18"/>
                 <w:szCs w:val="18"/>
               </w:rPr>
@@ -825,15 +842,26 @@
             <w:r>
               <w:rPr>
                 <w:rFonts w:ascii="DIN" w:hAnsi="DIN" w:cstheme="minorHAnsi"/>
+                <w:bCs/>
                 <w:sz w:val="18"/>
                 <w:szCs w:val="18"/>
               </w:rPr>
               <w:t xml:space="preserve"> </w:t>
             </w:r>
+            <w:r>
+              <w:rPr>
+                <w:rFonts w:ascii="DIN" w:hAnsi="DIN" w:cstheme="minorHAnsi"/>
+                <w:bCs/>
+                <w:sz w:val="18"/>
+                <w:szCs w:val="18"/>
+              </w:rPr>
+              <w:t>{</w:t>
+            </w:r>
             <w:proofErr w:type="spellStart"/>
             <w:r>
               <w:rPr>
                 <w:rFonts w:ascii="DIN" w:hAnsi="DIN" w:cstheme="minorHAnsi"/>
+                <w:bCs/>
                 <w:sz w:val="18"/>
                 <w:szCs w:val="18"/>
               </w:rPr>
@@ -843,6 +871,16 @@
             <w:r>
               <w:rPr>
                 <w:rFonts w:ascii="DIN" w:hAnsi="DIN" w:cstheme="minorHAnsi"/>
+                <w:bCs/>
+                <w:sz w:val="18"/>
+                <w:szCs w:val="18"/>
+              </w:rPr>
+              <w:t>}</w:t>
+            </w:r>
+            <w:r>
+              <w:rPr>
+                <w:rFonts w:ascii="DIN" w:hAnsi="DIN" w:cstheme="minorHAnsi"/>
+                <w:bCs/>
                 <w:sz w:val="18"/>
                 <w:szCs w:val="18"/>
               </w:rPr>
@@ -851,6 +889,7 @@
             <w:r>
               <w:rPr>
                 <w:rFonts w:ascii="DIN" w:hAnsi="DIN" w:cstheme="minorHAnsi"/>
+                <w:bCs/>
                 <w:sz w:val="18"/>
                 <w:szCs w:val="18"/>
               </w:rPr>
@@ -859,6 +898,7 @@
             <w:r>
               <w:rPr>
                 <w:rFonts w:ascii="DIN" w:hAnsi="DIN" w:cstheme="minorHAnsi"/>
+                <w:bCs/>
                 <w:sz w:val="18"/>
                 <w:szCs w:val="18"/>
               </w:rPr>
@@ -867,6 +907,7 @@
             <w:r>
               <w:rPr>
                 <w:rFonts w:ascii="DIN" w:hAnsi="DIN" w:cstheme="minorHAnsi"/>
+                <w:bCs/>
                 <w:sz w:val="18"/>
                 <w:szCs w:val="18"/>
               </w:rPr>
@@ -940,6 +981,7 @@
               <w:pStyle w:val="TableParagraph"/>
               <w:rPr>
                 <w:rFonts w:ascii="DIN" w:hAnsi="DIN" w:cstheme="minorHAnsi"/>
+                <w:bCs/>
                 <w:sz w:val="18"/>
                 <w:szCs w:val="18"/>
               </w:rPr>
@@ -947,21 +989,41 @@
             <w:r>
               <w:rPr>
                 <w:rFonts w:ascii="DIN" w:hAnsi="DIN" w:cstheme="minorHAnsi"/>
+                <w:bCs/>
                 <w:sz w:val="18"/>
                 <w:szCs w:val="18"/>
               </w:rPr>
               <w:t xml:space="preserve"> </w:t>
             </w:r>
+            <w:r>
+              <w:rPr>
+                <w:rFonts w:ascii="DIN" w:hAnsi="DIN" w:cstheme="minorHAnsi"/>
+                <w:bCs/>
+                <w:sz w:val="18"/>
+                <w:szCs w:val="18"/>
+              </w:rPr>
+              <w:t>{</w:t>
+            </w:r>
             <w:proofErr w:type="spellStart"/>
             <w:r>
               <w:rPr>
                 <w:rFonts w:ascii="DIN" w:hAnsi="DIN" w:cstheme="minorHAnsi"/>
+                <w:bCs/>
                 <w:sz w:val="18"/>
                 <w:szCs w:val="18"/>
               </w:rPr>
               <w:t>En_qualite_de</w:t>
             </w:r>
             <w:proofErr w:type="spellEnd"/>
+            <w:r>
+              <w:rPr>
+                <w:rFonts w:ascii="DIN" w:hAnsi="DIN" w:cstheme="minorHAnsi"/>
+                <w:bCs/>
+                <w:sz w:val="18"/>
+                <w:szCs w:val="18"/>
+              </w:rPr>
+              <w:t>}</w:t>
+            </w:r>
           </w:p>
         </w:tc>
       </w:tr>
@@ -1020,6 +1082,7 @@
               <w:pStyle w:val="TableParagraph"/>
               <w:rPr>
                 <w:rFonts w:ascii="DIN" w:hAnsi="DIN" w:cstheme="minorHAnsi"/>
+                <w:bCs/>
                 <w:sz w:val="18"/>
                 <w:szCs w:val="18"/>
                 <w:lang w:val="en-CA"/>
@@ -1028,22 +1091,43 @@
             <w:r>
               <w:rPr>
                 <w:rFonts w:ascii="DIN" w:hAnsi="DIN" w:cstheme="minorHAnsi"/>
+                <w:bCs/>
                 <w:sz w:val="18"/>
                 <w:szCs w:val="18"/>
                 <w:lang w:val="en-CA"/>
               </w:rPr>
               <w:t xml:space="preserve"> </w:t>
             </w:r>
+            <w:r>
+              <w:rPr>
+                <w:rFonts w:ascii="DIN" w:hAnsi="DIN" w:cstheme="minorHAnsi"/>
+                <w:bCs/>
+                <w:sz w:val="18"/>
+                <w:szCs w:val="18"/>
+                <w:lang w:val="en-CA"/>
+              </w:rPr>
+              <w:t>{</w:t>
+            </w:r>
             <w:proofErr w:type="spellStart"/>
             <w:r>
               <w:rPr>
                 <w:rFonts w:ascii="DIN" w:hAnsi="DIN" w:cstheme="minorHAnsi"/>
+                <w:bCs/>
                 <w:sz w:val="18"/>
                 <w:szCs w:val="18"/>
               </w:rPr>
               <w:t>Adresse_entreprise</w:t>
             </w:r>
             <w:proofErr w:type="spellEnd"/>
+            <w:r>
+              <w:rPr>
+                <w:rFonts w:ascii="DIN" w:hAnsi="DIN" w:cstheme="minorHAnsi"/>
+                <w:bCs/>
+                <w:sz w:val="18"/>
+                <w:szCs w:val="18"/>
+              </w:rPr>
+              <w:t>}</w:t>
+            </w:r>
           </w:p>
         </w:tc>
       </w:tr>
@@ -1101,6 +1185,7 @@
               <w:pStyle w:val="TableParagraph"/>
               <w:rPr>
                 <w:rFonts w:ascii="DIN" w:hAnsi="DIN" w:cstheme="minorHAnsi"/>
+                <w:bCs/>
                 <w:sz w:val="18"/>
                 <w:szCs w:val="18"/>
               </w:rPr>
@@ -1108,21 +1193,41 @@
             <w:r>
               <w:rPr>
                 <w:rFonts w:ascii="DIN" w:hAnsi="DIN" w:cstheme="minorHAnsi"/>
+                <w:bCs/>
                 <w:sz w:val="18"/>
                 <w:szCs w:val="18"/>
               </w:rPr>
               <w:t xml:space="preserve"> </w:t>
             </w:r>
+            <w:r>
+              <w:rPr>
+                <w:rFonts w:ascii="DIN" w:hAnsi="DIN" w:cstheme="minorHAnsi"/>
+                <w:bCs/>
+                <w:sz w:val="18"/>
+                <w:szCs w:val="18"/>
+              </w:rPr>
+              <w:t>{</w:t>
+            </w:r>
             <w:proofErr w:type="spellStart"/>
             <w:r>
               <w:rPr>
                 <w:rFonts w:ascii="DIN" w:hAnsi="DIN" w:cstheme="minorHAnsi"/>
+                <w:bCs/>
                 <w:sz w:val="18"/>
                 <w:szCs w:val="18"/>
               </w:rPr>
               <w:t>Ville_entreprise</w:t>
             </w:r>
             <w:proofErr w:type="spellEnd"/>
+            <w:r>
+              <w:rPr>
+                <w:rFonts w:ascii="DIN" w:hAnsi="DIN" w:cstheme="minorHAnsi"/>
+                <w:bCs/>
+                <w:sz w:val="18"/>
+                <w:szCs w:val="18"/>
+              </w:rPr>
+              <w:t>}</w:t>
+            </w:r>
           </w:p>
         </w:tc>
       </w:tr>
@@ -1180,6 +1285,7 @@
               <w:pStyle w:val="TableParagraph"/>
               <w:rPr>
                 <w:rFonts w:ascii="DIN" w:hAnsi="DIN" w:cstheme="minorHAnsi"/>
+                <w:bCs/>
                 <w:sz w:val="18"/>
                 <w:szCs w:val="18"/>
               </w:rPr>
@@ -1187,21 +1293,41 @@
             <w:r>
               <w:rPr>
                 <w:rFonts w:ascii="DIN" w:hAnsi="DIN" w:cstheme="minorHAnsi"/>
+                <w:bCs/>
                 <w:sz w:val="18"/>
                 <w:szCs w:val="18"/>
               </w:rPr>
               <w:t xml:space="preserve"> </w:t>
             </w:r>
+            <w:r>
+              <w:rPr>
+                <w:rFonts w:ascii="DIN" w:hAnsi="DIN" w:cstheme="minorHAnsi"/>
+                <w:bCs/>
+                <w:sz w:val="18"/>
+                <w:szCs w:val="18"/>
+              </w:rPr>
+              <w:t>{</w:t>
+            </w:r>
             <w:proofErr w:type="spellStart"/>
             <w:r>
               <w:rPr>
                 <w:rFonts w:ascii="DIN" w:hAnsi="DIN" w:cstheme="minorHAnsi"/>
+                <w:bCs/>
                 <w:sz w:val="18"/>
                 <w:szCs w:val="18"/>
               </w:rPr>
               <w:t>Code_Postal_entreprise</w:t>
             </w:r>
             <w:proofErr w:type="spellEnd"/>
+            <w:r>
+              <w:rPr>
+                <w:rFonts w:ascii="DIN" w:hAnsi="DIN" w:cstheme="minorHAnsi"/>
+                <w:bCs/>
+                <w:sz w:val="18"/>
+                <w:szCs w:val="18"/>
+              </w:rPr>
+              <w:t>}</w:t>
+            </w:r>
           </w:p>
         </w:tc>
       </w:tr>
@@ -1270,6 +1396,7 @@
               <w:pStyle w:val="TableParagraph"/>
               <w:rPr>
                 <w:rFonts w:ascii="DIN" w:hAnsi="DIN" w:cstheme="minorHAnsi"/>
+                <w:bCs/>
                 <w:sz w:val="18"/>
                 <w:szCs w:val="18"/>
               </w:rPr>
@@ -1277,21 +1404,41 @@
             <w:r>
               <w:rPr>
                 <w:rFonts w:ascii="DIN" w:hAnsi="DIN" w:cstheme="minorHAnsi"/>
+                <w:bCs/>
                 <w:sz w:val="18"/>
                 <w:szCs w:val="18"/>
               </w:rPr>
               <w:t xml:space="preserve"> </w:t>
             </w:r>
+            <w:r>
+              <w:rPr>
+                <w:rFonts w:ascii="DIN" w:hAnsi="DIN" w:cstheme="minorHAnsi"/>
+                <w:bCs/>
+                <w:sz w:val="18"/>
+                <w:szCs w:val="18"/>
+              </w:rPr>
+              <w:t>{</w:t>
+            </w:r>
             <w:proofErr w:type="spellStart"/>
             <w:r>
               <w:rPr>
                 <w:rFonts w:ascii="DIN" w:hAnsi="DIN" w:cstheme="minorHAnsi"/>
+                <w:bCs/>
                 <w:sz w:val="18"/>
                 <w:szCs w:val="18"/>
               </w:rPr>
               <w:t>Pays_entreprise</w:t>
             </w:r>
             <w:proofErr w:type="spellEnd"/>
+            <w:r>
+              <w:rPr>
+                <w:rFonts w:ascii="DIN" w:hAnsi="DIN" w:cstheme="minorHAnsi"/>
+                <w:bCs/>
+                <w:sz w:val="18"/>
+                <w:szCs w:val="18"/>
+              </w:rPr>
+              <w:t>}</w:t>
+            </w:r>
           </w:p>
         </w:tc>
       </w:tr>
@@ -1384,6 +1531,7 @@
               <w:pStyle w:val="TableParagraph"/>
               <w:rPr>
                 <w:rFonts w:ascii="DIN" w:hAnsi="DIN" w:cstheme="minorHAnsi"/>
+                <w:bCs/>
                 <w:noProof/>
                 <w:sz w:val="18"/>
                 <w:szCs w:val="18"/>
@@ -1392,6 +1540,7 @@
             <w:r>
               <w:rPr>
                 <w:rFonts w:ascii="DIN" w:hAnsi="DIN" w:cstheme="minorHAnsi"/>
+                <w:bCs/>
                 <w:sz w:val="18"/>
                 <w:szCs w:val="18"/>
               </w:rPr>
@@ -1400,6 +1549,16 @@
             <w:r>
               <w:rPr>
                 <w:rFonts w:ascii="DIN" w:hAnsi="DIN" w:cstheme="minorHAnsi"/>
+                <w:bCs/>
+                <w:sz w:val="18"/>
+                <w:szCs w:val="18"/>
+              </w:rPr>
+              <w:t>{</w:t>
+            </w:r>
+            <w:r>
+              <w:rPr>
+                <w:rFonts w:ascii="DIN" w:hAnsi="DIN" w:cstheme="minorHAnsi"/>
+                <w:bCs/>
                 <w:sz w:val="18"/>
                 <w:szCs w:val="18"/>
               </w:rPr>
@@ -1408,6 +1567,7 @@
             <w:r>
               <w:rPr>
                 <w:rFonts w:ascii="DIN" w:hAnsi="DIN" w:cstheme="minorHAnsi"/>
+                <w:bCs/>
                 <w:sz w:val="18"/>
                 <w:szCs w:val="18"/>
               </w:rPr>
@@ -1416,6 +1576,7 @@
             <w:r>
               <w:rPr>
                 <w:rFonts w:ascii="DIN" w:hAnsi="DIN" w:cstheme="minorHAnsi"/>
+                <w:bCs/>
                 <w:sz w:val="18"/>
                 <w:szCs w:val="18"/>
               </w:rPr>
@@ -1424,11 +1585,22 @@
             <w:r>
               <w:rPr>
                 <w:rFonts w:ascii="DIN" w:hAnsi="DIN" w:cstheme="minorHAnsi"/>
+                <w:bCs/>
                 <w:noProof/>
                 <w:sz w:val="18"/>
                 <w:szCs w:val="18"/>
               </w:rPr>
               <w:t>Telephone_Mail_entreprise</w:t>
+            </w:r>
+            <w:r>
+              <w:rPr>
+                <w:rFonts w:ascii="DIN" w:hAnsi="DIN" w:cstheme="minorHAnsi"/>
+                <w:bCs/>
+                <w:noProof/>
+                <w:sz w:val="18"/>
+                <w:szCs w:val="18"/>
+              </w:rPr>
+              <w:t>}</w:t>
             </w:r>
           </w:p>
           <w:p>
@@ -1436,6 +1608,7 @@
               <w:pStyle w:val="TableParagraph"/>
               <w:rPr>
                 <w:rFonts w:ascii="DIN" w:hAnsi="DIN" w:cstheme="minorHAnsi"/>
+                <w:bCs/>
                 <w:sz w:val="18"/>
                 <w:szCs w:val="18"/>
               </w:rPr>
@@ -1443,6 +1616,7 @@
             <w:r>
               <w:rPr>
                 <w:rFonts w:ascii="DIN" w:hAnsi="DIN" w:cstheme="minorHAnsi"/>
+                <w:bCs/>
                 <w:noProof/>
                 <w:sz w:val="18"/>
                 <w:szCs w:val="18"/>
@@ -1452,15 +1626,47 @@
             <w:r>
               <w:rPr>
                 <w:rFonts w:ascii="DIN" w:hAnsi="DIN" w:cstheme="minorHAnsi"/>
+                <w:bCs/>
                 <w:noProof/>
                 <w:sz w:val="18"/>
                 <w:szCs w:val="18"/>
               </w:rPr>
-              <w:t xml:space="preserve">Courriel_entreprise </w:t>
+              <w:t>{</w:t>
             </w:r>
             <w:r>
               <w:rPr>
                 <w:rFonts w:ascii="DIN" w:hAnsi="DIN" w:cstheme="minorHAnsi"/>
+                <w:bCs/>
+                <w:noProof/>
+                <w:sz w:val="18"/>
+                <w:szCs w:val="18"/>
+              </w:rPr>
+              <w:t>Courriel_entreprise</w:t>
+            </w:r>
+            <w:r>
+              <w:rPr>
+                <w:rFonts w:ascii="DIN" w:hAnsi="DIN" w:cstheme="minorHAnsi"/>
+                <w:bCs/>
+                <w:noProof/>
+                <w:sz w:val="18"/>
+                <w:szCs w:val="18"/>
+              </w:rPr>
+              <w:t>}</w:t>
+            </w:r>
+            <w:r>
+              <w:rPr>
+                <w:rFonts w:ascii="DIN" w:hAnsi="DIN" w:cstheme="minorHAnsi"/>
+                <w:bCs/>
+                <w:noProof/>
+                <w:sz w:val="18"/>
+                <w:szCs w:val="18"/>
+              </w:rPr>
+              <w:t xml:space="preserve"> </w:t>
+            </w:r>
+            <w:r>
+              <w:rPr>
+                <w:rFonts w:ascii="DIN" w:hAnsi="DIN" w:cstheme="minorHAnsi"/>
+                <w:bCs/>
                 <w:sz w:val="18"/>
                 <w:szCs w:val="18"/>
               </w:rPr>
@@ -1522,8 +1728,21 @@
                 <w:sz w:val="18"/>
                 <w:szCs w:val="18"/>
               </w:rPr>
-              <w:t xml:space="preserve"> registration number</w:t>
-            </w:r>
+              <w:t xml:space="preserve"> registration </w:t>
+            </w:r>
+            <w:proofErr w:type="spellStart"/>
+            <w:r>
+              <w:rPr>
+                <w:rFonts w:ascii="DIN" w:hAnsi="DIN"/>
+                <w:b/>
+                <w:i/>
+                <w:color w:val="2F2B7C"/>
+                <w:sz w:val="18"/>
+                <w:szCs w:val="18"/>
+              </w:rPr>
+              <w:t>number</w:t>
+            </w:r>
+            <w:proofErr w:type="spellEnd"/>
           </w:p>
         </w:tc>
         <w:tc>
@@ -1536,6 +1755,7 @@
               <w:pStyle w:val="TableParagraph"/>
               <w:rPr>
                 <w:rFonts w:ascii="DIN" w:hAnsi="DIN" w:cstheme="minorHAnsi"/>
+                <w:bCs/>
                 <w:sz w:val="18"/>
                 <w:szCs w:val="18"/>
               </w:rPr>
@@ -1543,10 +1763,20 @@
             <w:r>
               <w:rPr>
                 <w:rFonts w:ascii="DIN" w:hAnsi="DIN" w:cstheme="minorHAnsi"/>
+                <w:bCs/>
                 <w:sz w:val="18"/>
                 <w:szCs w:val="18"/>
               </w:rPr>
               <w:t xml:space="preserve"> </w:t>
+            </w:r>
+            <w:r>
+              <w:rPr>
+                <w:rFonts w:ascii="DIN" w:hAnsi="DIN" w:cstheme="minorHAnsi"/>
+                <w:bCs/>
+                <w:sz w:val="18"/>
+                <w:szCs w:val="18"/>
+              </w:rPr>
+              <w:t>{</w:t>
             </w:r>
             <w:proofErr w:type="spellStart"/>
             <w:r>
@@ -1561,6 +1791,17 @@
               <w:t>Numero_dimmatruculation_entreprise_SIRET</w:t>
             </w:r>
             <w:proofErr w:type="spellEnd"/>
+            <w:r>
+              <w:rPr>
+                <w:rFonts w:ascii="DIN" w:hAnsi="DIN"/>
+                <w:bCs/>
+                <w:iCs/>
+                <w:color w:val="000000" w:themeColor="text1"/>
+                <w:sz w:val="18"/>
+                <w:szCs w:val="18"/>
+              </w:rPr>
+              <w:t>}</w:t>
+            </w:r>
           </w:p>
         </w:tc>
       </w:tr>
@@ -1746,7 +1987,7 @@
               <w:pStyle w:val="TableParagraph"/>
               <w:rPr>
                 <w:rFonts w:ascii="DIN" w:hAnsi="DIN" w:cstheme="minorHAnsi"/>
-                <w:b/>
+                <w:bCs/>
                 <w:sz w:val="18"/>
                 <w:szCs w:val="18"/>
               </w:rPr>
@@ -1754,7 +1995,7 @@
             <w:r>
               <w:rPr>
                 <w:rFonts w:ascii="DIN" w:hAnsi="DIN" w:cstheme="minorHAnsi"/>
-                <w:b/>
+                <w:bCs/>
                 <w:iCs/>
                 <w:color w:val="000000" w:themeColor="text1"/>
                 <w:sz w:val="18"/>
@@ -1762,19 +2003,41 @@
               </w:rPr>
               <w:t xml:space="preserve"> </w:t>
             </w:r>
-            <w:proofErr w:type="spellStart"/>
             <w:r>
               <w:rPr>
                 <w:rFonts w:ascii="DIN" w:hAnsi="DIN" w:cstheme="minorHAnsi"/>
-                <w:b/>
+                <w:bCs/>
                 <w:iCs/>
                 <w:color w:val="000000" w:themeColor="text1"/>
                 <w:sz w:val="18"/>
                 <w:szCs w:val="18"/>
               </w:rPr>
+              <w:t>{</w:t>
+            </w:r>
+            <w:proofErr w:type="spellStart"/>
+            <w:r>
+              <w:rPr>
+                <w:rFonts w:ascii="DIN" w:hAnsi="DIN" w:cstheme="minorHAnsi"/>
+                <w:bCs/>
+                <w:iCs/>
+                <w:color w:val="000000" w:themeColor="text1"/>
+                <w:sz w:val="18"/>
+                <w:szCs w:val="18"/>
+              </w:rPr>
               <w:t>Nom_Etud</w:t>
             </w:r>
             <w:proofErr w:type="spellEnd"/>
+            <w:r>
+              <w:rPr>
+                <w:rFonts w:ascii="DIN" w:hAnsi="DIN" w:cstheme="minorHAnsi"/>
+                <w:bCs/>
+                <w:iCs/>
+                <w:color w:val="000000" w:themeColor="text1"/>
+                <w:sz w:val="18"/>
+                <w:szCs w:val="18"/>
+              </w:rPr>
+              <w:t>}</w:t>
+            </w:r>
           </w:p>
         </w:tc>
       </w:tr>
@@ -1832,7 +2095,6 @@
               <w:pStyle w:val="TableParagraph"/>
               <w:rPr>
                 <w:rFonts w:ascii="DIN" w:hAnsi="DIN" w:cstheme="minorHAnsi"/>
-                <w:b/>
                 <w:bCs/>
                 <w:sz w:val="18"/>
                 <w:szCs w:val="18"/>
@@ -1841,18 +2103,25 @@
             <w:r>
               <w:rPr>
                 <w:rFonts w:ascii="DIN" w:hAnsi="DIN" w:cstheme="minorHAnsi"/>
-                <w:b/>
                 <w:bCs/>
                 <w:sz w:val="18"/>
                 <w:szCs w:val="18"/>
               </w:rPr>
               <w:t xml:space="preserve"> </w:t>
             </w:r>
+            <w:r>
+              <w:rPr>
+                <w:rFonts w:ascii="DIN" w:hAnsi="DIN" w:cstheme="minorHAnsi"/>
+                <w:bCs/>
+                <w:sz w:val="18"/>
+                <w:szCs w:val="18"/>
+              </w:rPr>
+              <w:t>{</w:t>
+            </w:r>
             <w:proofErr w:type="spellStart"/>
             <w:r>
               <w:rPr>
                 <w:rFonts w:ascii="DIN" w:hAnsi="DIN" w:cstheme="minorHAnsi"/>
-                <w:b/>
                 <w:bCs/>
                 <w:sz w:val="18"/>
                 <w:szCs w:val="18"/>
@@ -1860,6 +2129,15 @@
               <w:t>Prenoom_Etud</w:t>
             </w:r>
             <w:proofErr w:type="spellEnd"/>
+            <w:r>
+              <w:rPr>
+                <w:rFonts w:ascii="DIN" w:hAnsi="DIN" w:cstheme="minorHAnsi"/>
+                <w:bCs/>
+                <w:sz w:val="18"/>
+                <w:szCs w:val="18"/>
+              </w:rPr>
+              <w:t>}</w:t>
+            </w:r>
           </w:p>
         </w:tc>
       </w:tr>
@@ -1982,6 +2260,14 @@
               </w:rPr>
               <w:t xml:space="preserve"> </w:t>
             </w:r>
+            <w:r>
+              <w:rPr>
+                <w:rFonts w:ascii="DIN" w:hAnsi="DIN" w:cstheme="minorHAnsi"/>
+                <w:sz w:val="18"/>
+                <w:szCs w:val="18"/>
+              </w:rPr>
+              <w:t>{</w:t>
+            </w:r>
             <w:proofErr w:type="spellStart"/>
             <w:r>
               <w:rPr>
@@ -1992,6 +2278,14 @@
               <w:t>Date_de_naissance_etudiant</w:t>
             </w:r>
             <w:proofErr w:type="spellEnd"/>
+            <w:r>
+              <w:rPr>
+                <w:rFonts w:ascii="DIN" w:hAnsi="DIN" w:cstheme="minorHAnsi"/>
+                <w:sz w:val="18"/>
+                <w:szCs w:val="18"/>
+              </w:rPr>
+              <w:t>}</w:t>
+            </w:r>
           </w:p>
         </w:tc>
       </w:tr>
@@ -2066,6 +2360,15 @@
               </w:rPr>
               <w:t xml:space="preserve"> </w:t>
             </w:r>
+            <w:r>
+              <w:rPr>
+                <w:rFonts w:ascii="DIN" w:hAnsi="DIN" w:cstheme="minorHAnsi"/>
+                <w:sz w:val="18"/>
+                <w:szCs w:val="18"/>
+                <w:lang w:val="en-US"/>
+              </w:rPr>
+              <w:t>{</w:t>
+            </w:r>
             <w:proofErr w:type="spellStart"/>
             <w:r>
               <w:rPr>
@@ -2076,6 +2379,14 @@
               <w:t>Type_of_internship</w:t>
             </w:r>
             <w:proofErr w:type="spellEnd"/>
+            <w:r>
+              <w:rPr>
+                <w:rFonts w:ascii="DIN" w:hAnsi="DIN" w:cstheme="minorHAnsi"/>
+                <w:sz w:val="18"/>
+                <w:szCs w:val="18"/>
+              </w:rPr>
+              <w:t>}</w:t>
+            </w:r>
           </w:p>
         </w:tc>
       </w:tr>
@@ -2145,6 +2456,14 @@
               </w:rPr>
               <w:t xml:space="preserve"> </w:t>
             </w:r>
+            <w:r>
+              <w:rPr>
+                <w:rFonts w:ascii="DIN" w:hAnsi="DIN" w:cstheme="minorHAnsi"/>
+                <w:sz w:val="18"/>
+                <w:szCs w:val="18"/>
+              </w:rPr>
+              <w:t>{</w:t>
+            </w:r>
             <w:proofErr w:type="spellStart"/>
             <w:r>
               <w:rPr>
@@ -2155,6 +2474,14 @@
               <w:t>Programme_etudiant</w:t>
             </w:r>
             <w:proofErr w:type="spellEnd"/>
+            <w:r>
+              <w:rPr>
+                <w:rFonts w:ascii="DIN" w:hAnsi="DIN" w:cstheme="minorHAnsi"/>
+                <w:sz w:val="18"/>
+                <w:szCs w:val="18"/>
+              </w:rPr>
+              <w:t>}</w:t>
+            </w:r>
           </w:p>
         </w:tc>
       </w:tr>
@@ -2413,16 +2740,7 @@
                 <w:sz w:val="18"/>
                 <w:szCs w:val="18"/>
               </w:rPr>
-              <w:t>en</w:t>
-            </w:r>
-            <w:r>
-              <w:rPr>
-                <w:rFonts w:ascii="DIN" w:hAnsi="DIN"/>
-                <w:b/>
-                <w:sz w:val="18"/>
-                <w:szCs w:val="18"/>
-              </w:rPr>
-              <w:t xml:space="preserve"> qualité de / </w:t>
+              <w:t xml:space="preserve">en qualité de / </w:t>
             </w:r>
             <w:r>
               <w:rPr>
@@ -2947,31 +3265,39 @@
               <w:pStyle w:val="TableParagraph"/>
               <w:rPr>
                 <w:rFonts w:ascii="DIN" w:hAnsi="DIN"/>
-                <w:b/>
-                <w:bCs/>
                 <w:sz w:val="16"/>
               </w:rPr>
             </w:pPr>
             <w:r>
               <w:rPr>
                 <w:rFonts w:ascii="DIN" w:hAnsi="DIN"/>
-                <w:b/>
-                <w:bCs/>
                 <w:sz w:val="16"/>
               </w:rPr>
               <w:t xml:space="preserve"> </w:t>
             </w:r>
+            <w:r>
+              <w:rPr>
+                <w:rFonts w:ascii="DIN" w:hAnsi="DIN"/>
+                <w:sz w:val="16"/>
+              </w:rPr>
+              <w:t>{</w:t>
+            </w:r>
             <w:proofErr w:type="spellStart"/>
             <w:r>
               <w:rPr>
                 <w:rFonts w:ascii="DIN" w:hAnsi="DIN"/>
-                <w:b/>
-                <w:bCs/>
                 <w:sz w:val="16"/>
               </w:rPr>
               <w:t>Date_debut_stage</w:t>
             </w:r>
             <w:proofErr w:type="spellEnd"/>
+            <w:r>
+              <w:rPr>
+                <w:rFonts w:ascii="DIN" w:hAnsi="DIN"/>
+                <w:sz w:val="16"/>
+              </w:rPr>
+              <w:t>}</w:t>
+            </w:r>
           </w:p>
         </w:tc>
         <w:tc>
@@ -3033,31 +3359,39 @@
               <w:pStyle w:val="TableParagraph"/>
               <w:rPr>
                 <w:rFonts w:ascii="DIN" w:hAnsi="DIN"/>
-                <w:b/>
-                <w:bCs/>
                 <w:sz w:val="16"/>
               </w:rPr>
             </w:pPr>
             <w:r>
               <w:rPr>
                 <w:rFonts w:ascii="DIN" w:hAnsi="DIN"/>
-                <w:b/>
-                <w:bCs/>
                 <w:sz w:val="16"/>
               </w:rPr>
               <w:t xml:space="preserve">  </w:t>
             </w:r>
+            <w:r>
+              <w:rPr>
+                <w:rFonts w:ascii="DIN" w:hAnsi="DIN"/>
+                <w:sz w:val="16"/>
+              </w:rPr>
+              <w:t>{</w:t>
+            </w:r>
             <w:proofErr w:type="spellStart"/>
             <w:r>
               <w:rPr>
                 <w:rFonts w:ascii="DIN" w:hAnsi="DIN"/>
-                <w:b/>
-                <w:bCs/>
                 <w:sz w:val="16"/>
               </w:rPr>
               <w:t>Date_fin_stage</w:t>
             </w:r>
             <w:proofErr w:type="spellEnd"/>
+            <w:r>
+              <w:rPr>
+                <w:rFonts w:ascii="DIN" w:hAnsi="DIN"/>
+                <w:sz w:val="16"/>
+              </w:rPr>
+              <w:t>}</w:t>
+            </w:r>
           </w:p>
         </w:tc>
       </w:tr>
@@ -3156,6 +3490,13 @@
               </w:rPr>
               <w:t xml:space="preserve"> </w:t>
             </w:r>
+            <w:r>
+              <w:rPr>
+                <w:rFonts w:ascii="DIN" w:hAnsi="DIN"/>
+                <w:sz w:val="16"/>
+              </w:rPr>
+              <w:t>{</w:t>
+            </w:r>
             <w:proofErr w:type="spellStart"/>
             <w:r>
               <w:rPr>
@@ -3165,6 +3506,13 @@
               <w:t>Nombre_de_semaines</w:t>
             </w:r>
             <w:proofErr w:type="spellEnd"/>
+            <w:r>
+              <w:rPr>
+                <w:rFonts w:ascii="DIN" w:hAnsi="DIN"/>
+                <w:sz w:val="16"/>
+              </w:rPr>
+              <w:t>}</w:t>
+            </w:r>
           </w:p>
         </w:tc>
         <w:tc>
@@ -3380,27 +3728,74 @@
           <w:sz w:val="18"/>
           <w:szCs w:val="18"/>
         </w:rPr>
-        <w:t>: ___</w:t>
+        <w:t xml:space="preserve">: </w:t>
+      </w:r>
+      <w:r>
+        <w:rPr>
+          <w:rFonts w:ascii="DIN" w:hAnsi="DIN"/>
+          <w:iCs/>
+          <w:sz w:val="18"/>
+          <w:szCs w:val="18"/>
+        </w:rPr>
+        <w:t>___</w:t>
+      </w:r>
+      <w:r>
+        <w:rPr>
+          <w:rFonts w:ascii="DIN" w:hAnsi="DIN"/>
+          <w:iCs/>
+          <w:sz w:val="18"/>
+          <w:szCs w:val="18"/>
+        </w:rPr>
+        <w:t>{</w:t>
       </w:r>
       <w:proofErr w:type="spellStart"/>
       <w:r>
         <w:rPr>
           <w:rFonts w:ascii="DIN" w:hAnsi="DIN"/>
-          <w:i/>
+          <w:iCs/>
           <w:sz w:val="18"/>
           <w:szCs w:val="18"/>
         </w:rPr>
-        <w:t>Gratification_intern</w:t>
+        <w:t>Gratification_</w:t>
+      </w:r>
+      <w:proofErr w:type="gramStart"/>
+      <w:r>
+        <w:rPr>
+          <w:rFonts w:ascii="DIN" w:hAnsi="DIN"/>
+          <w:iCs/>
+          <w:sz w:val="18"/>
+          <w:szCs w:val="18"/>
+        </w:rPr>
+        <w:t>intern</w:t>
       </w:r>
       <w:proofErr w:type="spellEnd"/>
       <w:r>
         <w:rPr>
           <w:rFonts w:ascii="DIN" w:hAnsi="DIN"/>
-          <w:i/>
+          <w:iCs/>
           <w:sz w:val="18"/>
           <w:szCs w:val="18"/>
         </w:rPr>
-        <w:t>________</w:t>
+        <w:t>}</w:t>
+      </w:r>
+      <w:r>
+        <w:rPr>
+          <w:rFonts w:ascii="DIN" w:hAnsi="DIN"/>
+          <w:iCs/>
+          <w:sz w:val="18"/>
+          <w:szCs w:val="18"/>
+        </w:rPr>
+        <w:t>_</w:t>
+      </w:r>
+      <w:proofErr w:type="gramEnd"/>
+      <w:r>
+        <w:rPr>
+          <w:rFonts w:ascii="DIN" w:hAnsi="DIN"/>
+          <w:iCs/>
+          <w:sz w:val="18"/>
+          <w:szCs w:val="18"/>
+        </w:rPr>
+        <w:t>_______</w:t>
       </w:r>
     </w:p>
     <w:p>
@@ -7741,25 +8136,6 @@
 </file>
 
 <file path=customXml/item1.xml><?xml version="1.0" encoding="utf-8"?>
-<p:properties xmlns:p="http://schemas.microsoft.com/office/2006/metadata/properties" xmlns:xsi="http://www.w3.org/2001/XMLSchema-instance" xmlns:pc="http://schemas.microsoft.com/office/infopath/2007/PartnerControls">
-  <documentManagement>
-    <lcf76f155ced4ddcb4097134ff3c332f xmlns="15be71d6-4bfc-46b9-98ed-ec012e0504a1">
-      <Terms xmlns="http://schemas.microsoft.com/office/infopath/2007/PartnerControls"/>
-    </lcf76f155ced4ddcb4097134ff3c332f>
-  </documentManagement>
-</p:properties>
-</file>
-
-<file path=customXml/item2.xml><?xml version="1.0" encoding="utf-8"?>
-<?mso-contentType ?>
-<FormTemplates xmlns="http://schemas.microsoft.com/sharepoint/v3/contenttype/forms">
-  <Display>DocumentLibraryForm</Display>
-  <Edit>DocumentLibraryForm</Edit>
-  <New>DocumentLibraryForm</New>
-</FormTemplates>
-</file>
-
-<file path=customXml/item3.xml><?xml version="1.0" encoding="utf-8"?>
 <ct:contentTypeSchema xmlns:ct="http://schemas.microsoft.com/office/2006/metadata/contentType" xmlns:ma="http://schemas.microsoft.com/office/2006/metadata/properties/metaAttributes" ct:_="" ma:_="" ma:contentTypeName="Document" ma:contentTypeID="0x010100EBDCFD5807316E46B021AA2FF5767BEB" ma:contentTypeVersion="13" ma:contentTypeDescription="Crée un document." ma:contentTypeScope="" ma:versionID="cca674f7b5b5ae06da6cf78bdac14322">
   <xsd:schema xmlns:xsd="http://www.w3.org/2001/XMLSchema" xmlns:xs="http://www.w3.org/2001/XMLSchema" xmlns:p="http://schemas.microsoft.com/office/2006/metadata/properties" xmlns:ns2="15be71d6-4bfc-46b9-98ed-ec012e0504a1" targetNamespace="http://schemas.microsoft.com/office/2006/metadata/properties" ma:root="true" ma:fieldsID="70560688dc37c3f5f64b47bae26a05ab" ns2:_="">
     <xsd:import namespace="15be71d6-4bfc-46b9-98ed-ec012e0504a1"/>
@@ -7955,29 +8331,30 @@
 </ct:contentTypeSchema>
 </file>
 
-<file path=customXml/item4.xml><?xml version="1.0" encoding="utf-8"?>
+<file path=customXml/item2.xml><?xml version="1.0" encoding="utf-8"?>
 <b:Sources xmlns:b="http://schemas.openxmlformats.org/officeDocument/2006/bibliography" xmlns="http://schemas.openxmlformats.org/officeDocument/2006/bibliography" SelectedStyle="\APASixthEditionOfficeOnline.xsl" StyleName="APA" Version="6"/>
 </file>
 
-<file path=customXml/itemProps1.xml><?xml version="1.0" encoding="utf-8"?>
-<ds:datastoreItem xmlns:ds="http://schemas.openxmlformats.org/officeDocument/2006/customXml" ds:itemID="{4F19BB00-BD97-4B17-80C2-CE0EE031E567}">
-  <ds:schemaRefs>
-    <ds:schemaRef ds:uri="http://schemas.microsoft.com/office/2006/metadata/properties"/>
-    <ds:schemaRef ds:uri="http://schemas.microsoft.com/office/infopath/2007/PartnerControls"/>
-    <ds:schemaRef ds:uri="15be71d6-4bfc-46b9-98ed-ec012e0504a1"/>
-  </ds:schemaRefs>
-</ds:datastoreItem>
+<file path=customXml/item3.xml><?xml version="1.0" encoding="utf-8"?>
+<p:properties xmlns:p="http://schemas.microsoft.com/office/2006/metadata/properties" xmlns:xsi="http://www.w3.org/2001/XMLSchema-instance" xmlns:pc="http://schemas.microsoft.com/office/infopath/2007/PartnerControls">
+  <documentManagement>
+    <lcf76f155ced4ddcb4097134ff3c332f xmlns="15be71d6-4bfc-46b9-98ed-ec012e0504a1">
+      <Terms xmlns="http://schemas.microsoft.com/office/infopath/2007/PartnerControls"/>
+    </lcf76f155ced4ddcb4097134ff3c332f>
+  </documentManagement>
+</p:properties>
 </file>
 
-<file path=customXml/itemProps2.xml><?xml version="1.0" encoding="utf-8"?>
-<ds:datastoreItem xmlns:ds="http://schemas.openxmlformats.org/officeDocument/2006/customXml" ds:itemID="{9653C7CB-D33C-48E2-96AE-A0EDCA629D37}">
-  <ds:schemaRefs>
-    <ds:schemaRef ds:uri="http://schemas.microsoft.com/sharepoint/v3/contenttype/forms"/>
-  </ds:schemaRefs>
-</ds:datastoreItem>
+<file path=customXml/item4.xml><?xml version="1.0" encoding="utf-8"?>
+<?mso-contentType ?>
+<FormTemplates xmlns="http://schemas.microsoft.com/sharepoint/v3/contenttype/forms">
+  <Display>DocumentLibraryForm</Display>
+  <Edit>DocumentLibraryForm</Edit>
+  <New>DocumentLibraryForm</New>
+</FormTemplates>
 </file>
 
-<file path=customXml/itemProps3.xml><?xml version="1.0" encoding="utf-8"?>
+<file path=customXml/itemProps1.xml><?xml version="1.0" encoding="utf-8"?>
 <ds:datastoreItem xmlns:ds="http://schemas.openxmlformats.org/officeDocument/2006/customXml" ds:itemID="{720D69E5-5573-4CF0-8768-8F69D8E19A54}">
   <ds:schemaRefs>
     <ds:schemaRef ds:uri="http://schemas.microsoft.com/office/2006/metadata/contentType"/>
@@ -7995,10 +8372,28 @@
 </ds:datastoreItem>
 </file>
 
-<file path=customXml/itemProps4.xml><?xml version="1.0" encoding="utf-8"?>
+<file path=customXml/itemProps2.xml><?xml version="1.0" encoding="utf-8"?>
 <ds:datastoreItem xmlns:ds="http://schemas.openxmlformats.org/officeDocument/2006/customXml" ds:itemID="{3F7E293B-27E1-4A5E-8B4D-5FE9580FEF15}">
   <ds:schemaRefs>
     <ds:schemaRef ds:uri="http://schemas.openxmlformats.org/officeDocument/2006/bibliography"/>
+  </ds:schemaRefs>
+</ds:datastoreItem>
+</file>
+
+<file path=customXml/itemProps3.xml><?xml version="1.0" encoding="utf-8"?>
+<ds:datastoreItem xmlns:ds="http://schemas.openxmlformats.org/officeDocument/2006/customXml" ds:itemID="{4F19BB00-BD97-4B17-80C2-CE0EE031E567}">
+  <ds:schemaRefs>
+    <ds:schemaRef ds:uri="http://schemas.microsoft.com/office/2006/metadata/properties"/>
+    <ds:schemaRef ds:uri="http://schemas.microsoft.com/office/infopath/2007/PartnerControls"/>
+    <ds:schemaRef ds:uri="15be71d6-4bfc-46b9-98ed-ec012e0504a1"/>
+  </ds:schemaRefs>
+</ds:datastoreItem>
+</file>
+
+<file path=customXml/itemProps4.xml><?xml version="1.0" encoding="utf-8"?>
+<ds:datastoreItem xmlns:ds="http://schemas.openxmlformats.org/officeDocument/2006/customXml" ds:itemID="{9653C7CB-D33C-48E2-96AE-A0EDCA629D37}">
+  <ds:schemaRefs>
+    <ds:schemaRef ds:uri="http://schemas.microsoft.com/sharepoint/v3/contenttype/forms"/>
   </ds:schemaRefs>
 </ds:datastoreItem>
 </file>

</xml_diff>